<commit_message>
Reading copies: compact 26-page main-text version (Word and PDF); title block fixed in the full copy
Co-Authored-By: Claude Opus 5.5 <noreply@anthropic.com>
Claude-Session: https://claude.ai/code/session_01XxH9J9TaLYfAYFCaGAqS9y
</commit_message>
<xml_diff>
--- a/papers/thesis_2026-10/reading/thesis_reading_copy_2026-10-15.docx
+++ b/papers/thesis_2026-10/reading/thesis_reading_copy_2026-10-15.docx
@@ -2,6 +2,190 @@
 <file path=word/document.xml><?xml version="1.0" encoding="utf-8"?>
 <w:document xmlns:w="http://schemas.openxmlformats.org/wordprocessingml/2006/main" xmlns:m="http://schemas.openxmlformats.org/officeDocument/2006/math" xmlns:r="http://schemas.openxmlformats.org/officeDocument/2006/relationships" xmlns:o="urn:schemas-microsoft-com:office:office" xmlns:v="urn:schemas-microsoft-com:vml" xmlns:w10="urn:schemas-microsoft-com:office:word" xmlns:a="http://schemas.openxmlformats.org/drawingml/2006/main" xmlns:pic="http://schemas.openxmlformats.org/drawingml/2006/picture" xmlns:wp="http://schemas.openxmlformats.org/drawingml/2006/wordprocessingDrawing">
   <w:body>
+    <w:p>
+      <w:pPr>
+        <w:pStyle w:val="Title"/>
+      </w:pPr>
+      <w:r>
+        <w:t xml:space="preserve">Invisible</w:t>
+      </w:r>
+      <w:r>
+        <w:t xml:space="preserve"> </w:t>
+      </w:r>
+      <w:r>
+        <w:t xml:space="preserve">Ledger:</w:t>
+      </w:r>
+      <w:r>
+        <w:t xml:space="preserve"> </w:t>
+      </w:r>
+      <w:r>
+        <w:t xml:space="preserve">thesis</w:t>
+      </w:r>
+      <w:r>
+        <w:t xml:space="preserve"> </w:t>
+      </w:r>
+      <w:r>
+        <w:t xml:space="preserve">draft,</w:t>
+      </w:r>
+      <w:r>
+        <w:t xml:space="preserve"> </w:t>
+      </w:r>
+      <w:r>
+        <w:t xml:space="preserve">Chapters</w:t>
+      </w:r>
+      <w:r>
+        <w:t xml:space="preserve"> </w:t>
+      </w:r>
+      <w:r>
+        <w:t xml:space="preserve">1</w:t>
+      </w:r>
+      <w:r>
+        <w:t xml:space="preserve"> </w:t>
+      </w:r>
+      <w:r>
+        <w:t xml:space="preserve">to</w:t>
+      </w:r>
+      <w:r>
+        <w:t xml:space="preserve"> </w:t>
+      </w:r>
+      <w:r>
+        <w:t xml:space="preserve">7</w:t>
+      </w:r>
+    </w:p>
+    <w:p>
+      <w:pPr>
+        <w:pStyle w:val="Subtitle"/>
+      </w:pPr>
+      <w:r>
+        <w:t xml:space="preserve">Reading</w:t>
+      </w:r>
+      <w:r>
+        <w:t xml:space="preserve"> </w:t>
+      </w:r>
+      <w:r>
+        <w:t xml:space="preserve">copy,</w:t>
+      </w:r>
+      <w:r>
+        <w:t xml:space="preserve"> </w:t>
+      </w:r>
+      <w:r>
+        <w:t xml:space="preserve">15</w:t>
+      </w:r>
+      <w:r>
+        <w:t xml:space="preserve"> </w:t>
+      </w:r>
+      <w:r>
+        <w:t xml:space="preserve">October</w:t>
+      </w:r>
+      <w:r>
+        <w:t xml:space="preserve"> </w:t>
+      </w:r>
+      <w:r>
+        <w:t xml:space="preserve">2026.</w:t>
+      </w:r>
+      <w:r>
+        <w:t xml:space="preserve"> </w:t>
+      </w:r>
+      <w:r>
+        <w:t xml:space="preserve">Chapters</w:t>
+      </w:r>
+      <w:r>
+        <w:t xml:space="preserve"> </w:t>
+      </w:r>
+      <w:r>
+        <w:t xml:space="preserve">6</w:t>
+      </w:r>
+      <w:r>
+        <w:t xml:space="preserve"> </w:t>
+      </w:r>
+      <w:r>
+        <w:t xml:space="preserve">and</w:t>
+      </w:r>
+      <w:r>
+        <w:t xml:space="preserve"> </w:t>
+      </w:r>
+      <w:r>
+        <w:t xml:space="preserve">7</w:t>
+      </w:r>
+      <w:r>
+        <w:t xml:space="preserve"> </w:t>
+      </w:r>
+      <w:r>
+        <w:t xml:space="preserve">are</w:t>
+      </w:r>
+      <w:r>
+        <w:t xml:space="preserve"> </w:t>
+      </w:r>
+      <w:r>
+        <w:t xml:space="preserve">drafts;</w:t>
+      </w:r>
+      <w:r>
+        <w:t xml:space="preserve"> </w:t>
+      </w:r>
+      <w:r>
+        <w:t xml:space="preserve">Section</w:t>
+      </w:r>
+      <w:r>
+        <w:t xml:space="preserve"> </w:t>
+      </w:r>
+      <w:r>
+        <w:t xml:space="preserve">6.5</w:t>
+      </w:r>
+      <w:r>
+        <w:t xml:space="preserve"> </w:t>
+      </w:r>
+      <w:r>
+        <w:t xml:space="preserve">has</w:t>
+      </w:r>
+      <w:r>
+        <w:t xml:space="preserve"> </w:t>
+      </w:r>
+      <w:r>
+        <w:t xml:space="preserve">a</w:t>
+      </w:r>
+      <w:r>
+        <w:t xml:space="preserve"> </w:t>
+      </w:r>
+      <w:r>
+        <w:t xml:space="preserve">slot</w:t>
+      </w:r>
+      <w:r>
+        <w:t xml:space="preserve"> </w:t>
+      </w:r>
+      <w:r>
+        <w:t xml:space="preserve">for</w:t>
+      </w:r>
+      <w:r>
+        <w:t xml:space="preserve"> </w:t>
+      </w:r>
+      <w:r>
+        <w:t xml:space="preserve">results</w:t>
+      </w:r>
+      <w:r>
+        <w:t xml:space="preserve"> </w:t>
+      </w:r>
+      <w:r>
+        <w:t xml:space="preserve">due</w:t>
+      </w:r>
+      <w:r>
+        <w:t xml:space="preserve"> </w:t>
+      </w:r>
+      <w:r>
+        <w:t xml:space="preserve">from</w:t>
+      </w:r>
+      <w:r>
+        <w:t xml:space="preserve"> </w:t>
+      </w:r>
+      <w:r>
+        <w:t xml:space="preserve">27</w:t>
+      </w:r>
+      <w:r>
+        <w:t xml:space="preserve"> </w:t>
+      </w:r>
+      <w:r>
+        <w:t xml:space="preserve">October.</w:t>
+      </w:r>
+    </w:p>
     <w:sdt>
       <w:sdtPr>
         <w:docPartObj>
@@ -28,60 +212,6 @@
         </w:p>
       </w:sdtContent>
     </w:sdt>
-    <w:p>
-      <w:r>
-        <w:pict>
-          <v:rect style="width:0;height:1.5pt" o:hralign="center" o:hrstd="t" o:hr="t"/>
-        </w:pict>
-      </w:r>
-    </w:p>
-    <w:p>
-      <w:pPr>
-        <w:pStyle w:val="FirstParagraph"/>
-      </w:pPr>
-      <w:r>
-        <w:t xml:space="preserve">title:</w:t>
-      </w:r>
-      <w:r>
-        <w:t xml:space="preserve"> </w:t>
-      </w:r>
-      <w:r>
-        <w:t xml:space="preserve">“</w:t>
-      </w:r>
-      <w:r>
-        <w:t xml:space="preserve">Invisible Ledger: thesis draft, Chapters 1 to 7</w:t>
-      </w:r>
-      <w:r>
-        <w:t xml:space="preserve">”</w:t>
-      </w:r>
-    </w:p>
-    <w:p>
-      <w:pPr>
-        <w:pStyle w:val="BodyText"/>
-      </w:pPr>
-      <w:r>
-        <w:t xml:space="preserve">subtitle:</w:t>
-      </w:r>
-      <w:r>
-        <w:t xml:space="preserve"> </w:t>
-      </w:r>
-      <w:r>
-        <w:t xml:space="preserve">“</w:t>
-      </w:r>
-      <w:r>
-        <w:t xml:space="preserve">Reading copy, 15 October 2026. Chapters 6 and 7 are drafts; Section 6.5 has a slot for results due from 27 October.</w:t>
-      </w:r>
-      <w:r>
-        <w:t xml:space="preserve">”</w:t>
-      </w:r>
-    </w:p>
-    <w:p>
-      <w:r>
-        <w:pict>
-          <v:rect style="width:0;height:1.5pt" o:hralign="center" o:hrstd="t" o:hr="t"/>
-        </w:pict>
-      </w:r>
-    </w:p>
     <w:bookmarkStart w:id="23" w:name="chapter-1.-introduction"/>
     <w:p>
       <w:pPr>

</xml_diff>